<commit_message>
adding collections as an optional thing
</commit_message>
<xml_diff>
--- a/test-cases/Question2.docx
+++ b/test-cases/Question2.docx
@@ -111,6 +111,97 @@
         <w:br/>
         <w:t>Preconditions:</w:t>
       </w:r>
+    </w:p>
+    <w:p>
+      <w:pPr>
+        <w:rPr>
+          <w:rFonts w:ascii="Aptos" w:hAnsi="Aptos"/>
+          <w:sz w:val="24"/>
+          <w:szCs w:val="24"/>
+        </w:rPr>
+      </w:pPr>
+      <w:r>
+        <w:rPr>
+          <w:rFonts w:ascii="Aptos" w:hAnsi="Aptos"/>
+          <w:sz w:val="24"/>
+          <w:szCs w:val="24"/>
+        </w:rPr>
+        <w:t>user1- indiamithu@yahoo.com</w:t>
+      </w:r>
+      <w:r>
+        <w:rPr>
+          <w:rFonts w:ascii="Aptos" w:hAnsi="Aptos"/>
+          <w:sz w:val="24"/>
+          <w:szCs w:val="24"/>
+        </w:rPr>
+        <w:br/>
+      </w:r>
+      <w:r>
+        <w:rPr>
+          <w:rFonts w:ascii="Aptos" w:hAnsi="Aptos"/>
+          <w:sz w:val="24"/>
+          <w:szCs w:val="24"/>
+        </w:rPr>
+        <w:t>user2</w:t>
+      </w:r>
+      <w:r>
+        <w:rPr>
+          <w:rFonts w:ascii="Aptos" w:hAnsi="Aptos"/>
+          <w:sz w:val="24"/>
+          <w:szCs w:val="24"/>
+        </w:rPr>
+        <w:t xml:space="preserve"> </w:t>
+      </w:r>
+      <w:r>
+        <w:rPr>
+          <w:rFonts w:ascii="Aptos" w:hAnsi="Aptos"/>
+          <w:sz w:val="24"/>
+          <w:szCs w:val="24"/>
+        </w:rPr>
+        <w:t>- e2euatstaging@spohn.co</w:t>
+      </w:r>
+      <w:r>
+        <w:rPr>
+          <w:rFonts w:ascii="Aptos" w:hAnsi="Aptos"/>
+          <w:sz w:val="24"/>
+          <w:szCs w:val="24"/>
+        </w:rPr>
+        <w:t xml:space="preserve"> </w:t>
+      </w:r>
+    </w:p>
+    <w:p>
+      <w:pPr>
+        <w:rPr>
+          <w:rFonts w:ascii="Aptos" w:hAnsi="Aptos"/>
+          <w:sz w:val="24"/>
+          <w:szCs w:val="24"/>
+        </w:rPr>
+      </w:pPr>
+      <w:r>
+        <w:rPr>
+          <w:rFonts w:ascii="Aptos" w:hAnsi="Aptos"/>
+          <w:sz w:val="24"/>
+          <w:szCs w:val="24"/>
+        </w:rPr>
+        <w:t>-</w:t>
+      </w:r>
+      <w:r>
+        <w:rPr>
+          <w:rFonts w:ascii="Aptos" w:hAnsi="Aptos"/>
+          <w:sz w:val="24"/>
+          <w:szCs w:val="24"/>
+        </w:rPr>
+        <w:t xml:space="preserve"> </w:t>
+      </w:r>
+      <w:r>
+        <w:rPr>
+          <w:rFonts w:ascii="Aptos" w:hAnsi="Aptos"/>
+          <w:sz w:val="24"/>
+          <w:szCs w:val="24"/>
+        </w:rPr>
+        <w:br/>
+        <w:t>- Both users have valid accounts and bookings</w:t>
+      </w:r>
       <w:r>
         <w:rPr>
           <w:rFonts w:ascii="Aptos" w:hAnsi="Aptos"/>
@@ -126,15 +217,15 @@
           <w:sz w:val="24"/>
           <w:szCs w:val="24"/>
         </w:rPr>
-        <w:t>user</w:t>
-      </w:r>
-      <w:r>
-        <w:rPr>
-          <w:rFonts w:ascii="Aptos" w:hAnsi="Aptos"/>
-          <w:sz w:val="24"/>
-          <w:szCs w:val="24"/>
-        </w:rPr>
-        <w:t xml:space="preserve">1 - </w:t>
+        <w:t>u</w:t>
+      </w:r>
+      <w:r>
+        <w:rPr>
+          <w:rFonts w:ascii="Aptos" w:hAnsi="Aptos"/>
+          <w:sz w:val="24"/>
+          <w:szCs w:val="24"/>
+        </w:rPr>
+        <w:t>ser1</w:t>
       </w:r>
       <w:r>
         <w:rPr>
@@ -144,7 +235,495 @@
         </w:rPr>
         <w:t xml:space="preserve"> </w:t>
       </w:r>
+      <w:r>
+        <w:rPr>
+          <w:rFonts w:ascii="Aptos" w:hAnsi="Aptos"/>
+          <w:sz w:val="24"/>
+          <w:szCs w:val="24"/>
+        </w:rPr>
+        <w:t xml:space="preserve">navigated to </w:t>
+      </w:r>
+      <w:r>
+        <w:rPr>
+          <w:rFonts w:ascii="Aptos" w:hAnsi="Aptos"/>
+          <w:sz w:val="24"/>
+          <w:szCs w:val="24"/>
+        </w:rPr>
+        <w:t>the “Begin Medical Questionnaire” step</w:t>
+      </w:r>
+      <w:r>
+        <w:rPr>
+          <w:rFonts w:ascii="Aptos" w:hAnsi="Aptos"/>
+          <w:sz w:val="24"/>
+          <w:szCs w:val="24"/>
+        </w:rPr>
+        <w:br/>
+      </w:r>
+      <w:r>
+        <w:rPr>
+          <w:rFonts w:ascii="Aptos" w:hAnsi="Aptos"/>
+          <w:sz w:val="24"/>
+          <w:szCs w:val="24"/>
+        </w:rPr>
+        <w:br/>
+        <w:t>Test Steps:</w:t>
+      </w:r>
+      <w:r>
+        <w:rPr>
+          <w:rFonts w:ascii="Aptos" w:hAnsi="Aptos"/>
+          <w:sz w:val="24"/>
+          <w:szCs w:val="24"/>
+        </w:rPr>
+        <w:br/>
+        <w:t xml:space="preserve">1. Log in as </w:t>
+      </w:r>
+      <w:r>
+        <w:rPr>
+          <w:rFonts w:ascii="Aptos" w:hAnsi="Aptos"/>
+          <w:sz w:val="24"/>
+          <w:szCs w:val="24"/>
+        </w:rPr>
+        <w:t>user1</w:t>
+      </w:r>
+      <w:r>
+        <w:rPr>
+          <w:rFonts w:ascii="Aptos" w:hAnsi="Aptos"/>
+          <w:sz w:val="24"/>
+          <w:szCs w:val="24"/>
+        </w:rPr>
+        <w:t>/</w:t>
+      </w:r>
+      <w:r>
+        <w:rPr>
+          <w:rFonts w:ascii="Aptos" w:hAnsi="Aptos"/>
+          <w:sz w:val="24"/>
+          <w:szCs w:val="24"/>
+        </w:rPr>
+        <w:t xml:space="preserve"> </w:t>
+      </w:r>
+      <w:r>
+        <w:rPr>
+          <w:rFonts w:ascii="Aptos" w:hAnsi="Aptos"/>
+          <w:sz w:val="24"/>
+          <w:szCs w:val="24"/>
+        </w:rPr>
+        <w:t>indiamithu@yahoo.com</w:t>
+      </w:r>
+      <w:r>
+        <w:rPr>
+          <w:rFonts w:ascii="Aptos" w:hAnsi="Aptos"/>
+          <w:sz w:val="24"/>
+          <w:szCs w:val="24"/>
+        </w:rPr>
+        <w:br/>
+        <w:t>2. Navigate to Begin Medical Questionnaire</w:t>
+      </w:r>
+      <w:r>
+        <w:rPr>
+          <w:rFonts w:ascii="Aptos" w:hAnsi="Aptos"/>
+          <w:sz w:val="24"/>
+          <w:szCs w:val="24"/>
+        </w:rPr>
+        <w:br/>
+        <w:t xml:space="preserve">3. Capture the </w:t>
+      </w:r>
+      <w:proofErr w:type="spellStart"/>
+      <w:r>
+        <w:rPr>
+          <w:rFonts w:ascii="Aptos" w:hAnsi="Aptos"/>
+          <w:sz w:val="24"/>
+          <w:szCs w:val="24"/>
+        </w:rPr>
+        <w:t>encounterId</w:t>
+      </w:r>
+      <w:proofErr w:type="spellEnd"/>
+      <w:r>
+        <w:rPr>
+          <w:rFonts w:ascii="Aptos" w:hAnsi="Aptos"/>
+          <w:sz w:val="24"/>
+          <w:szCs w:val="24"/>
+        </w:rPr>
+        <w:t xml:space="preserve"> from the request or URL</w:t>
+      </w:r>
+      <w:r>
+        <w:rPr>
+          <w:rFonts w:ascii="Aptos" w:hAnsi="Aptos"/>
+          <w:sz w:val="24"/>
+          <w:szCs w:val="24"/>
+        </w:rPr>
+        <w:t>-</w:t>
+      </w:r>
+      <w:r>
+        <w:t xml:space="preserve"> </w:t>
+      </w:r>
+      <w:r>
+        <w:t xml:space="preserve">here the encounter Id is </w:t>
+      </w:r>
+      <w:r>
+        <w:rPr>
+          <w:rFonts w:ascii="Aptos" w:hAnsi="Aptos"/>
+          <w:sz w:val="24"/>
+          <w:szCs w:val="24"/>
+        </w:rPr>
+        <w:t>80943b2a-55f0-4227-99bb-64aef7db5765</w:t>
+      </w:r>
+    </w:p>
+    <w:p>
+      <w:pPr>
+        <w:rPr>
+          <w:rFonts w:ascii="Aptos" w:hAnsi="Aptos"/>
+          <w:sz w:val="24"/>
+          <w:szCs w:val="24"/>
+        </w:rPr>
+      </w:pPr>
+      <w:r>
+        <w:rPr>
+          <w:rFonts w:ascii="Aptos" w:hAnsi="Aptos"/>
+          <w:sz w:val="24"/>
+          <w:szCs w:val="24"/>
+        </w:rPr>
+        <w:t xml:space="preserve">Here is the browser </w:t>
+      </w:r>
+      <w:proofErr w:type="spellStart"/>
+      <w:r>
+        <w:rPr>
+          <w:rFonts w:ascii="Aptos" w:hAnsi="Aptos"/>
+          <w:sz w:val="24"/>
+          <w:szCs w:val="24"/>
+        </w:rPr>
+        <w:t>url</w:t>
+      </w:r>
+      <w:proofErr w:type="spellEnd"/>
+      <w:r>
+        <w:rPr>
+          <w:rFonts w:ascii="Aptos" w:hAnsi="Aptos"/>
+          <w:sz w:val="24"/>
+          <w:szCs w:val="24"/>
+        </w:rPr>
+        <w:t>-</w:t>
+      </w:r>
+    </w:p>
+    <w:p>
+      <w:pPr>
+        <w:rPr>
+          <w:rFonts w:ascii="Aptos" w:hAnsi="Aptos"/>
+          <w:sz w:val="24"/>
+          <w:szCs w:val="24"/>
+        </w:rPr>
+      </w:pPr>
+      <w:r>
+        <w:rPr>
+          <w:rFonts w:ascii="Aptos" w:hAnsi="Aptos"/>
+          <w:sz w:val="24"/>
+          <w:szCs w:val="24"/>
+        </w:rPr>
+        <w:t>https://myezra-staging.ezra.com/medical-questionnaire?direct=true&amp;clearData=true&amp;extraData={%22encounterId%</w:t>
+      </w:r>
+      <w:proofErr w:type="gramStart"/>
+      <w:r>
+        <w:rPr>
+          <w:rFonts w:ascii="Aptos" w:hAnsi="Aptos"/>
+          <w:sz w:val="24"/>
+          <w:szCs w:val="24"/>
+        </w:rPr>
+        <w:t>22:%</w:t>
+      </w:r>
+      <w:proofErr w:type="gramEnd"/>
+      <w:r>
+        <w:rPr>
+          <w:rFonts w:ascii="Aptos" w:hAnsi="Aptos"/>
+          <w:sz w:val="24"/>
+          <w:szCs w:val="24"/>
+        </w:rPr>
+        <w:t>2280943b2a-55f0-4227-99bb-64aef7db5765%22}</w:t>
+      </w:r>
+    </w:p>
+    <w:p>
+      <w:r>
+        <w:rPr>
+          <w:rFonts w:ascii="Aptos" w:hAnsi="Aptos"/>
+          <w:sz w:val="24"/>
+          <w:szCs w:val="24"/>
+        </w:rPr>
+        <w:br/>
+        <w:t>4. Log out</w:t>
+      </w:r>
+      <w:r>
+        <w:rPr>
+          <w:rFonts w:ascii="Aptos" w:hAnsi="Aptos"/>
+          <w:sz w:val="24"/>
+          <w:szCs w:val="24"/>
+        </w:rPr>
+        <w:br/>
+        <w:t xml:space="preserve">5. Log in as </w:t>
+      </w:r>
+      <w:r>
+        <w:rPr>
+          <w:rFonts w:ascii="Aptos" w:hAnsi="Aptos"/>
+          <w:sz w:val="24"/>
+          <w:szCs w:val="24"/>
+        </w:rPr>
+        <w:t>user2</w:t>
+      </w:r>
+      <w:r>
+        <w:rPr>
+          <w:rFonts w:ascii="Aptos" w:hAnsi="Aptos"/>
+          <w:sz w:val="24"/>
+          <w:szCs w:val="24"/>
+        </w:rPr>
+        <w:t xml:space="preserve"> </w:t>
+      </w:r>
+      <w:r>
+        <w:rPr>
+          <w:rFonts w:ascii="Aptos" w:hAnsi="Aptos"/>
+          <w:sz w:val="24"/>
+          <w:szCs w:val="24"/>
+        </w:rPr>
+        <w:t>/</w:t>
+      </w:r>
+      <w:r>
+        <w:rPr>
+          <w:rFonts w:ascii="Aptos" w:hAnsi="Aptos"/>
+          <w:sz w:val="24"/>
+          <w:szCs w:val="24"/>
+        </w:rPr>
+        <w:t xml:space="preserve"> </w:t>
+      </w:r>
+      <w:r>
+        <w:rPr>
+          <w:rFonts w:ascii="Aptos" w:hAnsi="Aptos"/>
+          <w:sz w:val="24"/>
+          <w:szCs w:val="24"/>
+        </w:rPr>
+        <w:t xml:space="preserve">e2euatstaging@spohn.co </w:t>
+      </w:r>
+      <w:r>
+        <w:rPr>
+          <w:rFonts w:ascii="Aptos" w:hAnsi="Aptos"/>
+          <w:sz w:val="24"/>
+          <w:szCs w:val="24"/>
+        </w:rPr>
+        <w:br/>
+        <w:t xml:space="preserve">6. Attempt to access </w:t>
+      </w:r>
+      <w:r>
+        <w:rPr>
+          <w:rFonts w:ascii="Aptos" w:hAnsi="Aptos"/>
+          <w:sz w:val="24"/>
+          <w:szCs w:val="24"/>
+        </w:rPr>
+        <w:t xml:space="preserve">user1 </w:t>
+      </w:r>
+      <w:r>
+        <w:rPr>
+          <w:rFonts w:ascii="Aptos" w:hAnsi="Aptos"/>
+          <w:sz w:val="24"/>
+          <w:szCs w:val="24"/>
+        </w:rPr>
+        <w:t xml:space="preserve">’s questionnaire using </w:t>
+      </w:r>
+      <w:r>
+        <w:rPr>
+          <w:rFonts w:ascii="Aptos" w:hAnsi="Aptos"/>
+          <w:sz w:val="24"/>
+          <w:szCs w:val="24"/>
+        </w:rPr>
+        <w:t xml:space="preserve">user1 </w:t>
+      </w:r>
+      <w:r>
+        <w:rPr>
+          <w:rFonts w:ascii="Aptos" w:hAnsi="Aptos"/>
+          <w:sz w:val="24"/>
+          <w:szCs w:val="24"/>
+        </w:rPr>
+        <w:t xml:space="preserve">’s </w:t>
+      </w:r>
+      <w:proofErr w:type="spellStart"/>
+      <w:r>
+        <w:rPr>
+          <w:rFonts w:ascii="Aptos" w:hAnsi="Aptos"/>
+          <w:sz w:val="24"/>
+          <w:szCs w:val="24"/>
+        </w:rPr>
+        <w:t>encounterId</w:t>
+      </w:r>
+      <w:proofErr w:type="spellEnd"/>
+      <w:r>
+        <w:rPr>
+          <w:rFonts w:ascii="Aptos" w:hAnsi="Aptos"/>
+          <w:sz w:val="24"/>
+          <w:szCs w:val="24"/>
+        </w:rPr>
+        <w:t xml:space="preserve"> -</w:t>
+      </w:r>
+      <w:r>
+        <w:t xml:space="preserve"> </w:t>
+      </w:r>
+      <w:r>
+        <w:t>234a2b75-0c7a-4e22-929e-928687a18c32</w:t>
+      </w:r>
+      <w:r>
+        <w:t xml:space="preserve"> </w:t>
+      </w:r>
+    </w:p>
+    <w:p/>
+    <w:p>
+      <w:r>
+        <w:lastRenderedPageBreak/>
+        <w:t xml:space="preserve">Expected </w:t>
+      </w:r>
+      <w:r>
+        <w:t>Result: -</w:t>
+      </w:r>
+      <w:r>
+        <w:t xml:space="preserve"> user2/</w:t>
+      </w:r>
+      <w:r>
+        <w:rPr>
+          <w:rFonts w:ascii="Aptos" w:hAnsi="Aptos"/>
+          <w:sz w:val="24"/>
+          <w:szCs w:val="24"/>
+        </w:rPr>
+        <w:t xml:space="preserve"> </w:t>
+      </w:r>
+      <w:r>
+        <w:rPr>
+          <w:rFonts w:ascii="Aptos" w:hAnsi="Aptos"/>
+          <w:sz w:val="24"/>
+          <w:szCs w:val="24"/>
+        </w:rPr>
+        <w:t>e2euatstaging@spohn.co</w:t>
+      </w:r>
+      <w:r>
+        <w:t xml:space="preserve"> won’t be able to see questionnaire </w:t>
+      </w:r>
+      <w:r>
+        <w:t xml:space="preserve">of </w:t>
+      </w:r>
       <w:hyperlink r:id="rId5" w:history="1">
+        <w:r>
+          <w:rPr>
+            <w:rStyle w:val="Hyperlink"/>
+          </w:rPr>
+          <w:t>user1/indiamithu@yahoo.com</w:t>
+        </w:r>
+      </w:hyperlink>
+    </w:p>
+    <w:p>
+      <w:pPr>
+        <w:rPr>
+          <w:rFonts w:ascii="Aptos" w:hAnsi="Aptos"/>
+          <w:sz w:val="24"/>
+          <w:szCs w:val="24"/>
+        </w:rPr>
+      </w:pPr>
+      <w:r>
+        <w:t xml:space="preserve">Actual Result- user2 is immediately logged out and not able to get user1’s </w:t>
+      </w:r>
+      <w:r>
+        <w:t>questionnaire</w:t>
+      </w:r>
+    </w:p>
+    <w:p>
+      <w:pPr>
+        <w:rPr>
+          <w:rFonts w:ascii="Aptos" w:hAnsi="Aptos"/>
+          <w:sz w:val="24"/>
+          <w:szCs w:val="24"/>
+        </w:rPr>
+      </w:pPr>
+      <w:r>
+        <w:rPr>
+          <w:rFonts w:ascii="Aptos" w:hAnsi="Aptos"/>
+          <w:sz w:val="24"/>
+          <w:szCs w:val="24"/>
+        </w:rPr>
+        <w:br/>
+      </w:r>
+      <w:r>
+        <w:rPr>
+          <w:rFonts w:ascii="Aptos" w:hAnsi="Aptos"/>
+          <w:sz w:val="24"/>
+          <w:szCs w:val="24"/>
+        </w:rPr>
+        <w:br/>
+      </w:r>
+      <w:r>
+        <w:rPr>
+          <w:rFonts w:ascii="Aptos" w:hAnsi="Aptos"/>
+          <w:sz w:val="24"/>
+          <w:szCs w:val="24"/>
+        </w:rPr>
+        <w:br/>
+        <w:t>------------------------------------------------------</w:t>
+      </w:r>
+      <w:r>
+        <w:rPr>
+          <w:rFonts w:ascii="Aptos" w:hAnsi="Aptos"/>
+          <w:sz w:val="24"/>
+          <w:szCs w:val="24"/>
+        </w:rPr>
+        <w:br/>
+      </w:r>
+      <w:r>
+        <w:rPr>
+          <w:rFonts w:ascii="Aptos" w:hAnsi="Aptos"/>
+          <w:sz w:val="24"/>
+          <w:szCs w:val="24"/>
+        </w:rPr>
+        <w:br/>
+        <w:t>Part 2: HTTP Requests</w:t>
+      </w:r>
+      <w:r>
+        <w:rPr>
+          <w:rFonts w:ascii="Aptos" w:hAnsi="Aptos"/>
+          <w:sz w:val="24"/>
+          <w:szCs w:val="24"/>
+        </w:rPr>
+        <w:br/>
+      </w:r>
+      <w:r>
+        <w:rPr>
+          <w:rFonts w:ascii="Aptos" w:hAnsi="Aptos"/>
+          <w:sz w:val="24"/>
+          <w:szCs w:val="24"/>
+        </w:rPr>
+        <w:br/>
+      </w:r>
+      <w:r>
+        <w:rPr>
+          <w:rFonts w:ascii="Aptos" w:hAnsi="Aptos"/>
+          <w:sz w:val="24"/>
+          <w:szCs w:val="24"/>
+        </w:rPr>
+        <w:t>steps:</w:t>
+      </w:r>
+    </w:p>
+    <w:p>
+      <w:pPr>
+        <w:rPr>
+          <w:rFonts w:ascii="Aptos" w:hAnsi="Aptos"/>
+          <w:sz w:val="24"/>
+          <w:szCs w:val="24"/>
+        </w:rPr>
+      </w:pPr>
+      <w:r>
+        <w:rPr>
+          <w:rFonts w:ascii="Aptos" w:hAnsi="Aptos"/>
+          <w:sz w:val="24"/>
+          <w:szCs w:val="24"/>
+        </w:rPr>
+        <w:t>user password encounter id used in this:</w:t>
+      </w:r>
+      <w:r>
+        <w:rPr>
+          <w:rFonts w:ascii="Aptos" w:hAnsi="Aptos"/>
+          <w:sz w:val="24"/>
+          <w:szCs w:val="24"/>
+        </w:rPr>
+        <w:br/>
+      </w:r>
+      <w:hyperlink r:id="rId6" w:tgtFrame="_blank" w:tooltip="mailto:e2euatstaging@spohn.co" w:history="1">
         <w:r>
           <w:rPr>
             <w:rStyle w:val="Hyperlink"/>
@@ -161,392 +740,103 @@
           <w:sz w:val="24"/>
           <w:szCs w:val="24"/>
         </w:rPr>
-        <w:t xml:space="preserve"> </w:t>
-      </w:r>
-    </w:p>
-    <w:p>
-      <w:pPr>
-        <w:rPr>
-          <w:rFonts w:ascii="Aptos" w:hAnsi="Aptos"/>
-          <w:sz w:val="24"/>
-          <w:szCs w:val="24"/>
-        </w:rPr>
-      </w:pPr>
-      <w:r>
-        <w:rPr>
-          <w:rFonts w:ascii="Aptos" w:hAnsi="Aptos"/>
-          <w:sz w:val="24"/>
-          <w:szCs w:val="24"/>
-        </w:rPr>
-        <w:t>-user2</w:t>
-      </w:r>
-      <w:r>
-        <w:rPr>
-          <w:rFonts w:ascii="Aptos" w:hAnsi="Aptos"/>
-          <w:sz w:val="24"/>
-          <w:szCs w:val="24"/>
-        </w:rPr>
-        <w:t xml:space="preserve"> </w:t>
-      </w:r>
-      <w:r>
-        <w:rPr>
-          <w:rFonts w:ascii="Aptos" w:hAnsi="Aptos"/>
-          <w:sz w:val="24"/>
-          <w:szCs w:val="24"/>
-        </w:rPr>
-        <w:t>- indiamithu@yahoo.com</w:t>
-      </w:r>
-      <w:r>
-        <w:rPr>
-          <w:rFonts w:ascii="Aptos" w:hAnsi="Aptos"/>
-          <w:sz w:val="24"/>
-          <w:szCs w:val="24"/>
-        </w:rPr>
-        <w:br/>
-        <w:t>- Both users have valid accounts and bookings</w:t>
-      </w:r>
-      <w:r>
-        <w:rPr>
-          <w:rFonts w:ascii="Aptos" w:hAnsi="Aptos"/>
-          <w:sz w:val="24"/>
-          <w:szCs w:val="24"/>
-        </w:rPr>
-        <w:br/>
-        <w:t xml:space="preserve">- </w:t>
-      </w:r>
-      <w:r>
-        <w:rPr>
-          <w:rFonts w:ascii="Aptos" w:hAnsi="Aptos"/>
-          <w:sz w:val="24"/>
-          <w:szCs w:val="24"/>
-        </w:rPr>
-        <w:t>u</w:t>
-      </w:r>
-      <w:r>
-        <w:rPr>
-          <w:rFonts w:ascii="Aptos" w:hAnsi="Aptos"/>
-          <w:sz w:val="24"/>
-          <w:szCs w:val="24"/>
-        </w:rPr>
-        <w:t>ser1</w:t>
-      </w:r>
-      <w:r>
-        <w:rPr>
-          <w:rFonts w:ascii="Aptos" w:hAnsi="Aptos"/>
-          <w:sz w:val="24"/>
-          <w:szCs w:val="24"/>
-        </w:rPr>
-        <w:t xml:space="preserve"> </w:t>
-      </w:r>
-      <w:r>
-        <w:rPr>
-          <w:rFonts w:ascii="Aptos" w:hAnsi="Aptos"/>
-          <w:sz w:val="24"/>
-          <w:szCs w:val="24"/>
-        </w:rPr>
-        <w:t xml:space="preserve">navigated to </w:t>
-      </w:r>
-      <w:r>
-        <w:rPr>
-          <w:rFonts w:ascii="Aptos" w:hAnsi="Aptos"/>
-          <w:sz w:val="24"/>
-          <w:szCs w:val="24"/>
-        </w:rPr>
-        <w:t>the “Begin Medical Questionnaire” step</w:t>
-      </w:r>
-      <w:r>
-        <w:rPr>
-          <w:rFonts w:ascii="Aptos" w:hAnsi="Aptos"/>
-          <w:sz w:val="24"/>
-          <w:szCs w:val="24"/>
-        </w:rPr>
-        <w:br/>
-      </w:r>
-      <w:r>
-        <w:rPr>
-          <w:rFonts w:ascii="Aptos" w:hAnsi="Aptos"/>
-          <w:sz w:val="24"/>
-          <w:szCs w:val="24"/>
-        </w:rPr>
-        <w:br/>
-        <w:t>Test Steps:</w:t>
-      </w:r>
-      <w:r>
-        <w:rPr>
-          <w:rFonts w:ascii="Aptos" w:hAnsi="Aptos"/>
-          <w:sz w:val="24"/>
-          <w:szCs w:val="24"/>
-        </w:rPr>
-        <w:br/>
-        <w:t xml:space="preserve">1. Log in as </w:t>
-      </w:r>
-      <w:r>
-        <w:rPr>
-          <w:rFonts w:ascii="Aptos" w:hAnsi="Aptos"/>
-          <w:sz w:val="24"/>
-          <w:szCs w:val="24"/>
-        </w:rPr>
-        <w:t>user1</w:t>
-      </w:r>
-      <w:r>
-        <w:rPr>
-          <w:rFonts w:ascii="Aptos" w:hAnsi="Aptos"/>
-          <w:sz w:val="24"/>
-          <w:szCs w:val="24"/>
-        </w:rPr>
-        <w:br/>
-        <w:t>2. Navigate to Begin Medical Questionnaire</w:t>
-      </w:r>
-      <w:r>
-        <w:rPr>
-          <w:rFonts w:ascii="Aptos" w:hAnsi="Aptos"/>
-          <w:sz w:val="24"/>
-          <w:szCs w:val="24"/>
-        </w:rPr>
-        <w:br/>
-        <w:t>3. Capture the encounterId from the request or URL</w:t>
-      </w:r>
-      <w:r>
-        <w:rPr>
-          <w:rFonts w:ascii="Aptos" w:hAnsi="Aptos"/>
-          <w:sz w:val="24"/>
-          <w:szCs w:val="24"/>
-        </w:rPr>
-        <w:t>-</w:t>
-      </w:r>
-      <w:r>
-        <w:t xml:space="preserve"> </w:t>
-      </w:r>
-      <w:r>
-        <w:rPr>
-          <w:rFonts w:ascii="Aptos" w:hAnsi="Aptos"/>
-          <w:sz w:val="24"/>
-          <w:szCs w:val="24"/>
-        </w:rPr>
-        <w:t>80943b2a-55f0-4227-99bb-64aef7db5765</w:t>
-      </w:r>
-      <w:r>
-        <w:rPr>
-          <w:rFonts w:ascii="Aptos" w:hAnsi="Aptos"/>
-          <w:sz w:val="24"/>
-          <w:szCs w:val="24"/>
-        </w:rPr>
-        <w:br/>
-        <w:t>4. Log out</w:t>
-      </w:r>
-      <w:r>
-        <w:rPr>
-          <w:rFonts w:ascii="Aptos" w:hAnsi="Aptos"/>
-          <w:sz w:val="24"/>
-          <w:szCs w:val="24"/>
-        </w:rPr>
-        <w:br/>
-        <w:t xml:space="preserve">5. Log in as </w:t>
-      </w:r>
-      <w:r>
-        <w:rPr>
-          <w:rFonts w:ascii="Aptos" w:hAnsi="Aptos"/>
-          <w:sz w:val="24"/>
-          <w:szCs w:val="24"/>
-        </w:rPr>
-        <w:t>user2</w:t>
-      </w:r>
-      <w:r>
-        <w:rPr>
-          <w:rFonts w:ascii="Aptos" w:hAnsi="Aptos"/>
-          <w:sz w:val="24"/>
-          <w:szCs w:val="24"/>
-        </w:rPr>
-        <w:br/>
-        <w:t xml:space="preserve">6. Attempt to access </w:t>
-      </w:r>
-      <w:r>
-        <w:rPr>
-          <w:rFonts w:ascii="Aptos" w:hAnsi="Aptos"/>
-          <w:sz w:val="24"/>
-          <w:szCs w:val="24"/>
-        </w:rPr>
-        <w:t xml:space="preserve">user1 </w:t>
-      </w:r>
-      <w:r>
-        <w:rPr>
-          <w:rFonts w:ascii="Aptos" w:hAnsi="Aptos"/>
-          <w:sz w:val="24"/>
-          <w:szCs w:val="24"/>
-        </w:rPr>
-        <w:t xml:space="preserve">’s questionnaire using </w:t>
-      </w:r>
-      <w:r>
-        <w:rPr>
-          <w:rFonts w:ascii="Aptos" w:hAnsi="Aptos"/>
-          <w:sz w:val="24"/>
-          <w:szCs w:val="24"/>
-        </w:rPr>
-        <w:t xml:space="preserve">user1 </w:t>
-      </w:r>
-      <w:r>
-        <w:rPr>
-          <w:rFonts w:ascii="Aptos" w:hAnsi="Aptos"/>
-          <w:sz w:val="24"/>
-          <w:szCs w:val="24"/>
-        </w:rPr>
-        <w:t>’s encounterId</w:t>
-      </w:r>
-      <w:r>
-        <w:rPr>
-          <w:rFonts w:ascii="Aptos" w:hAnsi="Aptos"/>
-          <w:sz w:val="24"/>
-          <w:szCs w:val="24"/>
-        </w:rPr>
-        <w:t xml:space="preserve"> -</w:t>
-      </w:r>
-      <w:r>
-        <w:t xml:space="preserve"> </w:t>
-      </w:r>
-      <w:r>
-        <w:rPr>
-          <w:rFonts w:ascii="Aptos" w:hAnsi="Aptos"/>
-          <w:sz w:val="24"/>
-          <w:szCs w:val="24"/>
-        </w:rPr>
-        <w:t>80943b2a-55f0-4227-99bb-64aef7db5765</w:t>
-      </w:r>
-      <w:r>
-        <w:rPr>
-          <w:rFonts w:ascii="Aptos" w:hAnsi="Aptos"/>
-          <w:sz w:val="24"/>
-          <w:szCs w:val="24"/>
-        </w:rPr>
-        <w:br/>
-        <w:t xml:space="preserve">7. Attempt to update </w:t>
-      </w:r>
-      <w:r>
-        <w:rPr>
-          <w:rFonts w:ascii="Aptos" w:hAnsi="Aptos"/>
-          <w:sz w:val="24"/>
-          <w:szCs w:val="24"/>
-        </w:rPr>
-        <w:t>user1</w:t>
-      </w:r>
-      <w:r>
-        <w:rPr>
-          <w:rFonts w:ascii="Aptos" w:hAnsi="Aptos"/>
-          <w:sz w:val="24"/>
-          <w:szCs w:val="24"/>
-        </w:rPr>
-        <w:t>’s questionnaire</w:t>
-      </w:r>
-      <w:r>
-        <w:rPr>
-          <w:rFonts w:ascii="Aptos" w:hAnsi="Aptos"/>
-          <w:sz w:val="24"/>
-          <w:szCs w:val="24"/>
-        </w:rPr>
-        <w:br/>
-        <w:t xml:space="preserve">8. Attempt to submit </w:t>
-      </w:r>
-      <w:r>
-        <w:rPr>
-          <w:rFonts w:ascii="Aptos" w:hAnsi="Aptos"/>
-          <w:sz w:val="24"/>
-          <w:szCs w:val="24"/>
-        </w:rPr>
-        <w:t>user1</w:t>
-      </w:r>
-      <w:r>
-        <w:rPr>
-          <w:rFonts w:ascii="Aptos" w:hAnsi="Aptos"/>
-          <w:sz w:val="24"/>
-          <w:szCs w:val="24"/>
-        </w:rPr>
-        <w:t>’s questionnaire</w:t>
-      </w:r>
-      <w:r>
-        <w:rPr>
-          <w:rFonts w:ascii="Aptos" w:hAnsi="Aptos"/>
-          <w:sz w:val="24"/>
-          <w:szCs w:val="24"/>
-        </w:rPr>
-        <w:br/>
-      </w:r>
-      <w:r>
-        <w:rPr>
-          <w:rFonts w:ascii="Aptos" w:hAnsi="Aptos"/>
-          <w:sz w:val="24"/>
-          <w:szCs w:val="24"/>
-        </w:rPr>
-        <w:br/>
-        <w:t>Expected Result:</w:t>
-      </w:r>
-    </w:p>
-    <w:p>
-      <w:pPr>
-        <w:rPr>
-          <w:rFonts w:ascii="Aptos" w:hAnsi="Aptos"/>
-          <w:sz w:val="24"/>
-          <w:szCs w:val="24"/>
-        </w:rPr>
-      </w:pPr>
-      <w:r>
-        <w:rPr>
-          <w:rFonts w:ascii="Aptos" w:hAnsi="Aptos"/>
-          <w:sz w:val="24"/>
-          <w:szCs w:val="24"/>
-        </w:rPr>
-        <w:br/>
-        <w:t xml:space="preserve">- </w:t>
-      </w:r>
-      <w:r>
-        <w:rPr>
-          <w:rFonts w:ascii="Aptos" w:hAnsi="Aptos"/>
-          <w:sz w:val="24"/>
-          <w:szCs w:val="24"/>
-        </w:rPr>
-        <w:t>It logs out</w:t>
-      </w:r>
-      <w:r>
-        <w:rPr>
-          <w:rFonts w:ascii="Aptos" w:hAnsi="Aptos"/>
-          <w:sz w:val="24"/>
-          <w:szCs w:val="24"/>
-        </w:rPr>
-        <w:br/>
-        <w:t>- No medical data is exposed</w:t>
-      </w:r>
-      <w:r>
-        <w:rPr>
-          <w:rFonts w:ascii="Aptos" w:hAnsi="Aptos"/>
-          <w:sz w:val="24"/>
-          <w:szCs w:val="24"/>
-        </w:rPr>
-        <w:br/>
-        <w:t>- No updates or submissions are allowed</w:t>
-      </w:r>
-      <w:r>
-        <w:rPr>
-          <w:rFonts w:ascii="Aptos" w:hAnsi="Aptos"/>
-          <w:sz w:val="24"/>
-          <w:szCs w:val="24"/>
-        </w:rPr>
-        <w:br/>
-        <w:t>- Unauthorized attempts are logged</w:t>
-      </w:r>
-      <w:r>
-        <w:rPr>
-          <w:rFonts w:ascii="Aptos" w:hAnsi="Aptos"/>
-          <w:sz w:val="24"/>
-          <w:szCs w:val="24"/>
-        </w:rPr>
-        <w:br/>
-      </w:r>
-      <w:r>
-        <w:rPr>
-          <w:rFonts w:ascii="Aptos" w:hAnsi="Aptos"/>
-          <w:sz w:val="24"/>
-          <w:szCs w:val="24"/>
-        </w:rPr>
-        <w:br/>
-      </w:r>
+        <w:t> Peacock2025!  </w:t>
+      </w:r>
+      <w:r>
+        <w:rPr>
+          <w:rFonts w:ascii="Aptos" w:hAnsi="Aptos"/>
+          <w:sz w:val="24"/>
+          <w:szCs w:val="24"/>
+        </w:rPr>
+        <w:br/>
+        <w:t>234a2b75-0c7a-4e22-929e-928687a18c32</w:t>
+      </w:r>
+      <w:r>
+        <w:rPr>
+          <w:rFonts w:ascii="Aptos" w:hAnsi="Aptos"/>
+          <w:sz w:val="24"/>
+          <w:szCs w:val="24"/>
+        </w:rPr>
+        <w:br/>
+      </w:r>
+      <w:r>
+        <w:rPr>
+          <w:rFonts w:ascii="Aptos" w:hAnsi="Aptos"/>
+          <w:sz w:val="24"/>
+          <w:szCs w:val="24"/>
+        </w:rPr>
+        <w:br/>
+        <w:t>1) run "Get Bearer Token"</w:t>
+      </w:r>
+    </w:p>
+    <w:p>
+      <w:pPr>
+        <w:rPr>
+          <w:rFonts w:ascii="Aptos" w:hAnsi="Aptos"/>
+          <w:sz w:val="24"/>
+          <w:szCs w:val="24"/>
+        </w:rPr>
+      </w:pPr>
+      <w:r>
+        <w:rPr>
+          <w:rFonts w:ascii="Aptos" w:hAnsi="Aptos"/>
+          <w:sz w:val="24"/>
+          <w:szCs w:val="24"/>
+        </w:rPr>
+        <w:drawing>
+          <wp:inline distT="0" distB="0" distL="0" distR="0" wp14:anchorId="6AA0C8D0" wp14:editId="7D72A28A">
+            <wp:extent cx="5486400" cy="2891790"/>
+            <wp:effectExtent l="0" t="0" r="0" b="3810"/>
+            <wp:docPr id="1553248845" name="Picture 1"/>
+            <wp:cNvGraphicFramePr>
+              <a:graphicFrameLocks xmlns:a="http://schemas.openxmlformats.org/drawingml/2006/main" noChangeAspect="1"/>
+            </wp:cNvGraphicFramePr>
+            <a:graphic xmlns:a="http://schemas.openxmlformats.org/drawingml/2006/main">
+              <a:graphicData uri="http://schemas.openxmlformats.org/drawingml/2006/picture">
+                <pic:pic xmlns:pic="http://schemas.openxmlformats.org/drawingml/2006/picture">
+                  <pic:nvPicPr>
+                    <pic:cNvPr id="1553248845" name=""/>
+                    <pic:cNvPicPr/>
+                  </pic:nvPicPr>
+                  <pic:blipFill>
+                    <a:blip r:embed="rId7"/>
+                    <a:stretch>
+                      <a:fillRect/>
+                    </a:stretch>
+                  </pic:blipFill>
+                  <pic:spPr>
+                    <a:xfrm>
+                      <a:off x="0" y="0"/>
+                      <a:ext cx="5486400" cy="2891790"/>
+                    </a:xfrm>
+                    <a:prstGeom prst="rect">
+                      <a:avLst/>
+                    </a:prstGeom>
+                  </pic:spPr>
+                </pic:pic>
+              </a:graphicData>
+            </a:graphic>
+          </wp:inline>
+        </w:drawing>
+      </w:r>
+      <w:r>
+        <w:rPr>
+          <w:rFonts w:ascii="Aptos" w:hAnsi="Aptos"/>
+          <w:sz w:val="24"/>
+          <w:szCs w:val="24"/>
+        </w:rPr>
+        <w:br/>
+        <w:t>2) run "Get MQ Submission Detail"</w:t>
+      </w:r>
+    </w:p>
+    <w:p>
+      <w:pPr>
+        <w:rPr>
+          <w:rFonts w:ascii="Aptos" w:hAnsi="Aptos"/>
+          <w:sz w:val="24"/>
+          <w:szCs w:val="24"/>
+        </w:rPr>
+      </w:pPr>
       <w:r>
         <w:rPr>
           <w:rFonts w:ascii="Aptos" w:hAnsi="Aptos"/>
@@ -554,94 +844,145 @@
           <w:szCs w:val="24"/>
         </w:rPr>
         <w:lastRenderedPageBreak/>
-        <w:t>------------------------------------------------------</w:t>
-      </w:r>
-      <w:r>
-        <w:rPr>
-          <w:rFonts w:ascii="Aptos" w:hAnsi="Aptos"/>
-          <w:sz w:val="24"/>
-          <w:szCs w:val="24"/>
-        </w:rPr>
-        <w:br/>
-      </w:r>
-      <w:r>
-        <w:rPr>
-          <w:rFonts w:ascii="Aptos" w:hAnsi="Aptos"/>
-          <w:sz w:val="24"/>
-          <w:szCs w:val="24"/>
-        </w:rPr>
-        <w:br/>
-        <w:t>Part 2: HTTP Requests</w:t>
-      </w:r>
-      <w:r>
-        <w:rPr>
-          <w:rFonts w:ascii="Aptos" w:hAnsi="Aptos"/>
-          <w:sz w:val="24"/>
-          <w:szCs w:val="24"/>
-        </w:rPr>
-        <w:br/>
-      </w:r>
-      <w:r>
-        <w:rPr>
-          <w:rFonts w:ascii="Aptos" w:hAnsi="Aptos"/>
-          <w:sz w:val="24"/>
-          <w:szCs w:val="24"/>
-        </w:rPr>
-        <w:br/>
-        <w:t xml:space="preserve">1. Login as </w:t>
-      </w:r>
-      <w:r>
-        <w:rPr>
-          <w:rFonts w:ascii="Aptos" w:hAnsi="Aptos"/>
-          <w:sz w:val="24"/>
-          <w:szCs w:val="24"/>
-        </w:rPr>
-        <w:t>user1</w:t>
-      </w:r>
-      <w:r>
-        <w:rPr>
-          <w:rFonts w:ascii="Aptos" w:hAnsi="Aptos"/>
-          <w:sz w:val="24"/>
-          <w:szCs w:val="24"/>
-        </w:rPr>
-        <w:br/>
-      </w:r>
-      <w:r>
-        <w:rPr>
-          <w:rFonts w:ascii="Aptos" w:hAnsi="Aptos"/>
-          <w:sz w:val="24"/>
-          <w:szCs w:val="24"/>
-        </w:rPr>
-        <w:br/>
-        <w:t>POST /api/auth/login</w:t>
-      </w:r>
-      <w:r>
-        <w:rPr>
-          <w:rFonts w:ascii="Aptos" w:hAnsi="Aptos"/>
-          <w:sz w:val="24"/>
-          <w:szCs w:val="24"/>
-        </w:rPr>
-        <w:br/>
-        <w:t>{</w:t>
-      </w:r>
-      <w:r>
-        <w:rPr>
-          <w:rFonts w:ascii="Aptos" w:hAnsi="Aptos"/>
-          <w:sz w:val="24"/>
-          <w:szCs w:val="24"/>
-        </w:rPr>
-        <w:br/>
-        <w:t xml:space="preserve">  "email": </w:t>
-      </w:r>
-      <w:r>
-        <w:rPr>
-          <w:rFonts w:ascii="Aptos" w:hAnsi="Aptos"/>
-          <w:sz w:val="24"/>
-          <w:szCs w:val="24"/>
-        </w:rPr>
-        <w:t>“</w:t>
-      </w:r>
-      <w:hyperlink r:id="rId6" w:history="1">
+        <w:drawing>
+          <wp:inline distT="0" distB="0" distL="0" distR="0" wp14:anchorId="175BAC97" wp14:editId="6835FD0A">
+            <wp:extent cx="5486400" cy="2745740"/>
+            <wp:effectExtent l="0" t="0" r="0" b="0"/>
+            <wp:docPr id="1738898853" name="Picture 1"/>
+            <wp:cNvGraphicFramePr>
+              <a:graphicFrameLocks xmlns:a="http://schemas.openxmlformats.org/drawingml/2006/main" noChangeAspect="1"/>
+            </wp:cNvGraphicFramePr>
+            <a:graphic xmlns:a="http://schemas.openxmlformats.org/drawingml/2006/main">
+              <a:graphicData uri="http://schemas.openxmlformats.org/drawingml/2006/picture">
+                <pic:pic xmlns:pic="http://schemas.openxmlformats.org/drawingml/2006/picture">
+                  <pic:nvPicPr>
+                    <pic:cNvPr id="1738898853" name=""/>
+                    <pic:cNvPicPr/>
+                  </pic:nvPicPr>
+                  <pic:blipFill>
+                    <a:blip r:embed="rId8"/>
+                    <a:stretch>
+                      <a:fillRect/>
+                    </a:stretch>
+                  </pic:blipFill>
+                  <pic:spPr>
+                    <a:xfrm>
+                      <a:off x="0" y="0"/>
+                      <a:ext cx="5486400" cy="2745740"/>
+                    </a:xfrm>
+                    <a:prstGeom prst="rect">
+                      <a:avLst/>
+                    </a:prstGeom>
+                  </pic:spPr>
+                </pic:pic>
+              </a:graphicData>
+            </a:graphic>
+          </wp:inline>
+        </w:drawing>
+      </w:r>
+      <w:r>
+        <w:rPr>
+          <w:rFonts w:ascii="Aptos" w:hAnsi="Aptos"/>
+          <w:sz w:val="24"/>
+          <w:szCs w:val="24"/>
+        </w:rPr>
+        <w:br/>
+        <w:t>3) run "Get MQ Submission Data"</w:t>
+      </w:r>
+      <w:r>
+        <w:rPr>
+          <w:rFonts w:ascii="Aptos" w:hAnsi="Aptos"/>
+          <w:sz w:val="24"/>
+          <w:szCs w:val="24"/>
+        </w:rPr>
+        <w:br/>
+      </w:r>
+    </w:p>
+    <w:p>
+      <w:pPr>
+        <w:rPr>
+          <w:rFonts w:ascii="Aptos" w:hAnsi="Aptos"/>
+          <w:sz w:val="24"/>
+          <w:szCs w:val="24"/>
+        </w:rPr>
+      </w:pPr>
+      <w:r>
+        <w:rPr>
+          <w:rFonts w:ascii="Aptos" w:hAnsi="Aptos"/>
+          <w:sz w:val="24"/>
+          <w:szCs w:val="24"/>
+        </w:rPr>
+        <w:drawing>
+          <wp:inline distT="0" distB="0" distL="0" distR="0" wp14:anchorId="13BB085A" wp14:editId="52A7B722">
+            <wp:extent cx="5486400" cy="2843530"/>
+            <wp:effectExtent l="0" t="0" r="0" b="0"/>
+            <wp:docPr id="1635314575" name="Picture 1"/>
+            <wp:cNvGraphicFramePr>
+              <a:graphicFrameLocks xmlns:a="http://schemas.openxmlformats.org/drawingml/2006/main" noChangeAspect="1"/>
+            </wp:cNvGraphicFramePr>
+            <a:graphic xmlns:a="http://schemas.openxmlformats.org/drawingml/2006/main">
+              <a:graphicData uri="http://schemas.openxmlformats.org/drawingml/2006/picture">
+                <pic:pic xmlns:pic="http://schemas.openxmlformats.org/drawingml/2006/picture">
+                  <pic:nvPicPr>
+                    <pic:cNvPr id="1635314575" name=""/>
+                    <pic:cNvPicPr/>
+                  </pic:nvPicPr>
+                  <pic:blipFill>
+                    <a:blip r:embed="rId9"/>
+                    <a:stretch>
+                      <a:fillRect/>
+                    </a:stretch>
+                  </pic:blipFill>
+                  <pic:spPr>
+                    <a:xfrm>
+                      <a:off x="0" y="0"/>
+                      <a:ext cx="5486400" cy="2843530"/>
+                    </a:xfrm>
+                    <a:prstGeom prst="rect">
+                      <a:avLst/>
+                    </a:prstGeom>
+                  </pic:spPr>
+                </pic:pic>
+              </a:graphicData>
+            </a:graphic>
+          </wp:inline>
+        </w:drawing>
+      </w:r>
+      <w:r>
+        <w:rPr>
+          <w:rFonts w:ascii="Aptos" w:hAnsi="Aptos"/>
+          <w:sz w:val="24"/>
+          <w:szCs w:val="24"/>
+        </w:rPr>
+        <w:br/>
+      </w:r>
+      <w:r>
+        <w:rPr>
+          <w:rFonts w:ascii="Aptos" w:hAnsi="Aptos"/>
+          <w:sz w:val="24"/>
+          <w:szCs w:val="24"/>
+        </w:rPr>
+        <w:br/>
+      </w:r>
+      <w:r>
+        <w:rPr>
+          <w:rFonts w:ascii="Aptos" w:hAnsi="Aptos"/>
+          <w:sz w:val="24"/>
+          <w:szCs w:val="24"/>
+        </w:rPr>
+        <w:br/>
+        <w:t>if you change encounter ID variable to that of another user</w:t>
+      </w:r>
+      <w:r>
+        <w:rPr>
+          <w:rFonts w:ascii="Aptos" w:hAnsi="Aptos"/>
+          <w:sz w:val="24"/>
+          <w:szCs w:val="24"/>
+        </w:rPr>
+        <w:br/>
+        <w:t> </w:t>
+      </w:r>
+      <w:hyperlink r:id="rId10" w:tgtFrame="_blank" w:tooltip="mailto:jdvance@ggmail.com" w:history="1">
         <w:r>
           <w:rPr>
             <w:rStyle w:val="Hyperlink"/>
@@ -649,7 +990,7 @@
             <w:sz w:val="24"/>
             <w:szCs w:val="24"/>
           </w:rPr>
-          <w:t>e2euatstaging@spohn.co</w:t>
+          <w:t>jdvance@ggmail.com</w:t>
         </w:r>
       </w:hyperlink>
       <w:r>
@@ -658,353 +999,69 @@
           <w:sz w:val="24"/>
           <w:szCs w:val="24"/>
         </w:rPr>
-        <w:t xml:space="preserve"> </w:t>
-      </w:r>
-      <w:r>
-        <w:rPr>
-          <w:rFonts w:ascii="Aptos" w:hAnsi="Aptos"/>
-          <w:sz w:val="24"/>
-          <w:szCs w:val="24"/>
-        </w:rPr>
-        <w:t>",</w:t>
-      </w:r>
-      <w:r>
-        <w:rPr>
-          <w:rFonts w:ascii="Aptos" w:hAnsi="Aptos"/>
-          <w:sz w:val="24"/>
-          <w:szCs w:val="24"/>
-        </w:rPr>
-        <w:br/>
-        <w:t xml:space="preserve">  "password": "</w:t>
-      </w:r>
-      <w:r>
-        <w:rPr>
-          <w:rFonts w:ascii="Aptos" w:hAnsi="Aptos"/>
-          <w:sz w:val="24"/>
-          <w:szCs w:val="24"/>
-        </w:rPr>
-        <w:t>Peacock2025!</w:t>
-      </w:r>
-      <w:r>
-        <w:rPr>
-          <w:rFonts w:ascii="Aptos" w:hAnsi="Aptos"/>
-          <w:sz w:val="24"/>
-          <w:szCs w:val="24"/>
-        </w:rPr>
-        <w:t xml:space="preserve"> </w:t>
-      </w:r>
-      <w:r>
-        <w:rPr>
-          <w:rFonts w:ascii="Aptos" w:hAnsi="Aptos"/>
-          <w:sz w:val="24"/>
-          <w:szCs w:val="24"/>
-        </w:rPr>
-        <w:t>"</w:t>
-      </w:r>
-      <w:r>
-        <w:rPr>
-          <w:rFonts w:ascii="Aptos" w:hAnsi="Aptos"/>
-          <w:sz w:val="24"/>
-          <w:szCs w:val="24"/>
-        </w:rPr>
-        <w:br/>
-        <w:t>}</w:t>
-      </w:r>
-      <w:r>
-        <w:rPr>
-          <w:rFonts w:ascii="Aptos" w:hAnsi="Aptos"/>
-          <w:sz w:val="24"/>
-          <w:szCs w:val="24"/>
-        </w:rPr>
-        <w:br/>
-      </w:r>
-      <w:r>
-        <w:rPr>
-          <w:rFonts w:ascii="Aptos" w:hAnsi="Aptos"/>
-          <w:sz w:val="24"/>
-          <w:szCs w:val="24"/>
-        </w:rPr>
-        <w:br/>
-        <w:t>Expected: 200 OK with accessToken</w:t>
-      </w:r>
-      <w:r>
-        <w:rPr>
-          <w:rFonts w:ascii="Aptos" w:hAnsi="Aptos"/>
-          <w:sz w:val="24"/>
-          <w:szCs w:val="24"/>
-        </w:rPr>
-        <w:br/>
-      </w:r>
-      <w:r>
-        <w:rPr>
-          <w:rFonts w:ascii="Aptos" w:hAnsi="Aptos"/>
-          <w:sz w:val="24"/>
-          <w:szCs w:val="24"/>
-        </w:rPr>
-        <w:br/>
-        <w:t>------------------------------------------------------</w:t>
-      </w:r>
-      <w:r>
-        <w:rPr>
-          <w:rFonts w:ascii="Aptos" w:hAnsi="Aptos"/>
-          <w:sz w:val="24"/>
-          <w:szCs w:val="24"/>
-        </w:rPr>
-        <w:br/>
-      </w:r>
-      <w:r>
-        <w:rPr>
-          <w:rFonts w:ascii="Aptos" w:hAnsi="Aptos"/>
-          <w:sz w:val="24"/>
-          <w:szCs w:val="24"/>
-        </w:rPr>
-        <w:br/>
-        <w:t xml:space="preserve">2. Get </w:t>
-      </w:r>
-      <w:r>
-        <w:rPr>
-          <w:rFonts w:ascii="Aptos" w:hAnsi="Aptos"/>
-          <w:sz w:val="24"/>
-          <w:szCs w:val="24"/>
-        </w:rPr>
-        <w:t>user1</w:t>
-      </w:r>
-      <w:r>
-        <w:rPr>
-          <w:rFonts w:ascii="Aptos" w:hAnsi="Aptos"/>
-          <w:sz w:val="24"/>
-          <w:szCs w:val="24"/>
-        </w:rPr>
-        <w:t>’s</w:t>
-      </w:r>
-      <w:r>
-        <w:rPr>
-          <w:rFonts w:ascii="Aptos" w:hAnsi="Aptos"/>
-          <w:sz w:val="24"/>
-          <w:szCs w:val="24"/>
-        </w:rPr>
-        <w:t xml:space="preserve"> Questionnaire</w:t>
-      </w:r>
-      <w:r>
-        <w:rPr>
-          <w:rFonts w:ascii="Aptos" w:hAnsi="Aptos"/>
-          <w:sz w:val="24"/>
-          <w:szCs w:val="24"/>
-        </w:rPr>
-        <w:br/>
-      </w:r>
-      <w:r>
-        <w:rPr>
-          <w:rFonts w:ascii="Aptos" w:hAnsi="Aptos"/>
-          <w:sz w:val="24"/>
-          <w:szCs w:val="24"/>
-        </w:rPr>
-        <w:br/>
-        <w:t>GET /api/medical-questionnaire?encounterId=encounterA</w:t>
-      </w:r>
-      <w:r>
-        <w:rPr>
-          <w:rFonts w:ascii="Aptos" w:hAnsi="Aptos"/>
-          <w:sz w:val="24"/>
-          <w:szCs w:val="24"/>
-        </w:rPr>
-        <w:br/>
-        <w:t>Authorization: Bearer tokenA</w:t>
-      </w:r>
-      <w:r>
-        <w:rPr>
-          <w:rFonts w:ascii="Aptos" w:hAnsi="Aptos"/>
-          <w:sz w:val="24"/>
-          <w:szCs w:val="24"/>
-        </w:rPr>
-        <w:br/>
-      </w:r>
-      <w:r>
-        <w:rPr>
-          <w:rFonts w:ascii="Aptos" w:hAnsi="Aptos"/>
-          <w:sz w:val="24"/>
-          <w:szCs w:val="24"/>
-        </w:rPr>
-        <w:br/>
-        <w:t>Expected: 200 OK with questionnaire data</w:t>
-      </w:r>
-      <w:r>
-        <w:rPr>
-          <w:rFonts w:ascii="Aptos" w:hAnsi="Aptos"/>
-          <w:sz w:val="24"/>
-          <w:szCs w:val="24"/>
-        </w:rPr>
-        <w:br/>
-      </w:r>
-      <w:r>
-        <w:rPr>
-          <w:rFonts w:ascii="Aptos" w:hAnsi="Aptos"/>
-          <w:sz w:val="24"/>
-          <w:szCs w:val="24"/>
-        </w:rPr>
-        <w:br/>
-        <w:t>------------------------------------------------------</w:t>
-      </w:r>
-      <w:r>
-        <w:rPr>
-          <w:rFonts w:ascii="Aptos" w:hAnsi="Aptos"/>
-          <w:sz w:val="24"/>
-          <w:szCs w:val="24"/>
-        </w:rPr>
-        <w:br/>
-      </w:r>
-      <w:r>
-        <w:rPr>
-          <w:rFonts w:ascii="Aptos" w:hAnsi="Aptos"/>
-          <w:sz w:val="24"/>
-          <w:szCs w:val="24"/>
-        </w:rPr>
-        <w:br/>
-        <w:t xml:space="preserve">3. Login as </w:t>
-      </w:r>
-      <w:r>
-        <w:rPr>
-          <w:rFonts w:ascii="Aptos" w:hAnsi="Aptos"/>
-          <w:sz w:val="24"/>
-          <w:szCs w:val="24"/>
-        </w:rPr>
-        <w:t>user2</w:t>
-      </w:r>
-      <w:r>
-        <w:rPr>
-          <w:rFonts w:ascii="Aptos" w:hAnsi="Aptos"/>
-          <w:sz w:val="24"/>
-          <w:szCs w:val="24"/>
-        </w:rPr>
-        <w:br/>
-      </w:r>
-      <w:r>
-        <w:rPr>
-          <w:rFonts w:ascii="Aptos" w:hAnsi="Aptos"/>
-          <w:sz w:val="24"/>
-          <w:szCs w:val="24"/>
-        </w:rPr>
-        <w:br/>
-        <w:t>POST /api/auth/login</w:t>
-      </w:r>
-      <w:r>
-        <w:rPr>
-          <w:rFonts w:ascii="Aptos" w:hAnsi="Aptos"/>
-          <w:sz w:val="24"/>
-          <w:szCs w:val="24"/>
-        </w:rPr>
-        <w:br/>
-        <w:t>{</w:t>
-      </w:r>
-      <w:r>
-        <w:rPr>
-          <w:rFonts w:ascii="Aptos" w:hAnsi="Aptos"/>
-          <w:sz w:val="24"/>
-          <w:szCs w:val="24"/>
-        </w:rPr>
-        <w:br/>
-        <w:t xml:space="preserve">  "email": "</w:t>
-      </w:r>
-      <w:r>
-        <w:rPr>
-          <w:rFonts w:ascii="Aptos" w:hAnsi="Aptos"/>
-          <w:sz w:val="24"/>
-          <w:szCs w:val="24"/>
-        </w:rPr>
-        <w:t>indiamithu@yahoo.com</w:t>
-      </w:r>
-      <w:r>
-        <w:rPr>
-          <w:rFonts w:ascii="Aptos" w:hAnsi="Aptos"/>
-          <w:sz w:val="24"/>
-          <w:szCs w:val="24"/>
-        </w:rPr>
-        <w:t>",</w:t>
-      </w:r>
-      <w:r>
-        <w:rPr>
-          <w:rFonts w:ascii="Aptos" w:hAnsi="Aptos"/>
-          <w:sz w:val="24"/>
-          <w:szCs w:val="24"/>
-        </w:rPr>
-        <w:br/>
-        <w:t xml:space="preserve">  "password": "</w:t>
-      </w:r>
-      <w:r>
-        <w:rPr>
-          <w:rFonts w:ascii="Aptos" w:hAnsi="Aptos"/>
-          <w:sz w:val="24"/>
-          <w:szCs w:val="24"/>
-        </w:rPr>
-        <w:t>AryaMithu201##</w:t>
-      </w:r>
-      <w:r>
-        <w:rPr>
-          <w:rFonts w:ascii="Aptos" w:hAnsi="Aptos"/>
-          <w:sz w:val="24"/>
-          <w:szCs w:val="24"/>
-        </w:rPr>
-        <w:t>"</w:t>
-      </w:r>
-      <w:r>
-        <w:rPr>
-          <w:rFonts w:ascii="Aptos" w:hAnsi="Aptos"/>
-          <w:sz w:val="24"/>
-          <w:szCs w:val="24"/>
-        </w:rPr>
-        <w:br/>
-        <w:t>}</w:t>
-      </w:r>
-      <w:r>
-        <w:rPr>
-          <w:rFonts w:ascii="Aptos" w:hAnsi="Aptos"/>
-          <w:sz w:val="24"/>
-          <w:szCs w:val="24"/>
-        </w:rPr>
-        <w:br/>
-      </w:r>
-      <w:r>
-        <w:rPr>
-          <w:rFonts w:ascii="Aptos" w:hAnsi="Aptos"/>
-          <w:sz w:val="24"/>
-          <w:szCs w:val="24"/>
-        </w:rPr>
-        <w:br/>
-        <w:t>Expected: 200 OK with accessToken</w:t>
-      </w:r>
-      <w:r>
-        <w:rPr>
-          <w:rFonts w:ascii="Aptos" w:hAnsi="Aptos"/>
-          <w:sz w:val="24"/>
-          <w:szCs w:val="24"/>
-        </w:rPr>
-        <w:br/>
-      </w:r>
-      <w:r>
-        <w:rPr>
-          <w:rFonts w:ascii="Aptos" w:hAnsi="Aptos"/>
-          <w:sz w:val="24"/>
-          <w:szCs w:val="24"/>
-        </w:rPr>
-        <w:br/>
-        <w:t>------------------------------------------------------</w:t>
-      </w:r>
-      <w:r>
-        <w:rPr>
-          <w:rFonts w:ascii="Aptos" w:hAnsi="Aptos"/>
-          <w:sz w:val="24"/>
-          <w:szCs w:val="24"/>
-        </w:rPr>
-        <w:br/>
-      </w:r>
-      <w:r>
-        <w:rPr>
-          <w:rFonts w:ascii="Aptos" w:hAnsi="Aptos"/>
-          <w:sz w:val="24"/>
-          <w:szCs w:val="24"/>
-        </w:rPr>
-        <w:br/>
-        <w:t>4. Unauthorized Read Attempt</w:t>
+        <w:t> Peacock2025!  </w:t>
+      </w:r>
+      <w:r>
+        <w:rPr>
+          <w:rFonts w:ascii="Aptos" w:hAnsi="Aptos"/>
+          <w:sz w:val="24"/>
+          <w:szCs w:val="24"/>
+        </w:rPr>
+        <w:br/>
+        <w:t>122c3301-59ad-413c-adde-8ab3d3d49cd9</w:t>
+      </w:r>
+    </w:p>
+    <w:p>
+      <w:pPr>
+        <w:rPr>
+          <w:rFonts w:ascii="Aptos" w:hAnsi="Aptos"/>
+          <w:sz w:val="24"/>
+          <w:szCs w:val="24"/>
+        </w:rPr>
+      </w:pPr>
+      <w:r>
+        <w:rPr>
+          <w:rFonts w:ascii="Aptos" w:hAnsi="Aptos"/>
+          <w:sz w:val="24"/>
+          <w:szCs w:val="24"/>
+        </w:rPr>
+        <w:br/>
+      </w:r>
+      <w:proofErr w:type="gramStart"/>
+      <w:r>
+        <w:rPr>
+          <w:rFonts w:ascii="Aptos" w:hAnsi="Aptos"/>
+          <w:sz w:val="24"/>
+          <w:szCs w:val="24"/>
+        </w:rPr>
+        <w:t>so  234</w:t>
+      </w:r>
+      <w:proofErr w:type="gramEnd"/>
+      <w:r>
+        <w:rPr>
+          <w:rFonts w:ascii="Aptos" w:hAnsi="Aptos"/>
+          <w:sz w:val="24"/>
+          <w:szCs w:val="24"/>
+        </w:rPr>
+        <w:t>a2b75-0c7a-4e22-929e-928687a18c32 -</w:t>
+      </w:r>
+      <w:proofErr w:type="gramStart"/>
+      <w:r>
+        <w:rPr>
+          <w:rFonts w:ascii="Aptos" w:hAnsi="Aptos"/>
+          <w:sz w:val="24"/>
+          <w:szCs w:val="24"/>
+        </w:rPr>
+        <w:t>&gt;  122</w:t>
+      </w:r>
+      <w:proofErr w:type="gramEnd"/>
+      <w:r>
+        <w:rPr>
+          <w:rFonts w:ascii="Aptos" w:hAnsi="Aptos"/>
+          <w:sz w:val="24"/>
+          <w:szCs w:val="24"/>
+        </w:rPr>
+        <w:t>c3301-59ad-413c-adde-8ab3d3d49cd9 but keeping everything else the same and re-do the 3 steps,</w:t>
       </w:r>
       <w:r>
         <w:rPr>
@@ -1022,328 +1079,172 @@
         </w:rPr>
         <w:lastRenderedPageBreak/>
         <w:br/>
-        <w:t>GET /api/medical-questionnaire?encounterId=encounterA</w:t>
-      </w:r>
-      <w:r>
-        <w:rPr>
-          <w:rFonts w:ascii="Aptos" w:hAnsi="Aptos"/>
-          <w:sz w:val="24"/>
-          <w:szCs w:val="24"/>
-        </w:rPr>
-        <w:br/>
-        <w:t>Authorization: Bearer tokenB</w:t>
-      </w:r>
-      <w:r>
-        <w:rPr>
-          <w:rFonts w:ascii="Aptos" w:hAnsi="Aptos"/>
-          <w:sz w:val="24"/>
-          <w:szCs w:val="24"/>
-        </w:rPr>
-        <w:br/>
-      </w:r>
-      <w:r>
-        <w:rPr>
-          <w:rFonts w:ascii="Aptos" w:hAnsi="Aptos"/>
-          <w:sz w:val="24"/>
-          <w:szCs w:val="24"/>
-        </w:rPr>
-        <w:br/>
-        <w:t>Expected: 403 Forbidden or 404 Not Found</w:t>
-      </w:r>
-      <w:r>
-        <w:rPr>
-          <w:rFonts w:ascii="Aptos" w:hAnsi="Aptos"/>
-          <w:sz w:val="24"/>
-          <w:szCs w:val="24"/>
-        </w:rPr>
-        <w:br/>
-      </w:r>
-      <w:r>
-        <w:rPr>
-          <w:rFonts w:ascii="Aptos" w:hAnsi="Aptos"/>
-          <w:sz w:val="24"/>
-          <w:szCs w:val="24"/>
-        </w:rPr>
-        <w:br/>
-        <w:t>------------------------------------------------------</w:t>
-      </w:r>
-      <w:r>
-        <w:rPr>
-          <w:rFonts w:ascii="Aptos" w:hAnsi="Aptos"/>
-          <w:sz w:val="24"/>
-          <w:szCs w:val="24"/>
-        </w:rPr>
-        <w:br/>
-      </w:r>
-      <w:r>
-        <w:rPr>
-          <w:rFonts w:ascii="Aptos" w:hAnsi="Aptos"/>
-          <w:sz w:val="24"/>
-          <w:szCs w:val="24"/>
-        </w:rPr>
-        <w:br/>
-        <w:t>5. Unauthorized Update Attempt</w:t>
-      </w:r>
-      <w:r>
-        <w:rPr>
-          <w:rFonts w:ascii="Aptos" w:hAnsi="Aptos"/>
-          <w:sz w:val="24"/>
-          <w:szCs w:val="24"/>
-        </w:rPr>
-        <w:br/>
-      </w:r>
-      <w:r>
-        <w:rPr>
-          <w:rFonts w:ascii="Aptos" w:hAnsi="Aptos"/>
-          <w:sz w:val="24"/>
-          <w:szCs w:val="24"/>
-        </w:rPr>
-        <w:br/>
-        <w:t>PUT /api/medical-questionnaire/encounterA</w:t>
-      </w:r>
-      <w:r>
-        <w:rPr>
-          <w:rFonts w:ascii="Aptos" w:hAnsi="Aptos"/>
-          <w:sz w:val="24"/>
-          <w:szCs w:val="24"/>
-        </w:rPr>
-        <w:br/>
-        <w:t>Authorization: Bearer tokenB</w:t>
-      </w:r>
-      <w:r>
-        <w:rPr>
-          <w:rFonts w:ascii="Aptos" w:hAnsi="Aptos"/>
-          <w:sz w:val="24"/>
-          <w:szCs w:val="24"/>
-        </w:rPr>
-        <w:br/>
-      </w:r>
-      <w:r>
-        <w:rPr>
-          <w:rFonts w:ascii="Aptos" w:hAnsi="Aptos"/>
-          <w:sz w:val="24"/>
-          <w:szCs w:val="24"/>
-        </w:rPr>
-        <w:br/>
-        <w:t>{</w:t>
-      </w:r>
-      <w:r>
-        <w:rPr>
-          <w:rFonts w:ascii="Aptos" w:hAnsi="Aptos"/>
-          <w:sz w:val="24"/>
-          <w:szCs w:val="24"/>
-        </w:rPr>
-        <w:br/>
-        <w:t xml:space="preserve">  "answers": [</w:t>
-      </w:r>
-      <w:r>
-        <w:rPr>
-          <w:rFonts w:ascii="Aptos" w:hAnsi="Aptos"/>
-          <w:sz w:val="24"/>
-          <w:szCs w:val="24"/>
-        </w:rPr>
-        <w:br/>
-        <w:t xml:space="preserve">    {</w:t>
-      </w:r>
-      <w:r>
-        <w:rPr>
-          <w:rFonts w:ascii="Aptos" w:hAnsi="Aptos"/>
-          <w:sz w:val="24"/>
-          <w:szCs w:val="24"/>
-        </w:rPr>
-        <w:br/>
-        <w:t xml:space="preserve">      "questionId": "q1",</w:t>
-      </w:r>
-      <w:r>
-        <w:rPr>
-          <w:rFonts w:ascii="Aptos" w:hAnsi="Aptos"/>
-          <w:sz w:val="24"/>
-          <w:szCs w:val="24"/>
-        </w:rPr>
-        <w:br/>
-        <w:t xml:space="preserve">      "answer": "Yes"</w:t>
-      </w:r>
-      <w:r>
-        <w:rPr>
-          <w:rFonts w:ascii="Aptos" w:hAnsi="Aptos"/>
-          <w:sz w:val="24"/>
-          <w:szCs w:val="24"/>
-        </w:rPr>
-        <w:br/>
-        <w:t xml:space="preserve">    }</w:t>
-      </w:r>
-      <w:r>
-        <w:rPr>
-          <w:rFonts w:ascii="Aptos" w:hAnsi="Aptos"/>
-          <w:sz w:val="24"/>
-          <w:szCs w:val="24"/>
-        </w:rPr>
-        <w:br/>
-        <w:t xml:space="preserve">  ]</w:t>
-      </w:r>
-      <w:r>
-        <w:rPr>
-          <w:rFonts w:ascii="Aptos" w:hAnsi="Aptos"/>
-          <w:sz w:val="24"/>
-          <w:szCs w:val="24"/>
-        </w:rPr>
-        <w:br/>
-        <w:t>}</w:t>
-      </w:r>
-      <w:r>
-        <w:rPr>
-          <w:rFonts w:ascii="Aptos" w:hAnsi="Aptos"/>
-          <w:sz w:val="24"/>
-          <w:szCs w:val="24"/>
-        </w:rPr>
-        <w:br/>
-      </w:r>
-      <w:r>
-        <w:rPr>
-          <w:rFonts w:ascii="Aptos" w:hAnsi="Aptos"/>
-          <w:sz w:val="24"/>
-          <w:szCs w:val="24"/>
-        </w:rPr>
-        <w:br/>
-        <w:t>Expected: 403 Forbidden or 404 Not Found</w:t>
-      </w:r>
-      <w:r>
-        <w:rPr>
-          <w:rFonts w:ascii="Aptos" w:hAnsi="Aptos"/>
-          <w:sz w:val="24"/>
-          <w:szCs w:val="24"/>
-        </w:rPr>
-        <w:br/>
-      </w:r>
-      <w:r>
-        <w:rPr>
-          <w:rFonts w:ascii="Aptos" w:hAnsi="Aptos"/>
-          <w:sz w:val="24"/>
-          <w:szCs w:val="24"/>
-        </w:rPr>
-        <w:br/>
-        <w:t>------------------------------------------------------</w:t>
-      </w:r>
-      <w:r>
-        <w:rPr>
-          <w:rFonts w:ascii="Aptos" w:hAnsi="Aptos"/>
-          <w:sz w:val="24"/>
-          <w:szCs w:val="24"/>
-        </w:rPr>
-        <w:br/>
-      </w:r>
-      <w:r>
-        <w:rPr>
-          <w:rFonts w:ascii="Aptos" w:hAnsi="Aptos"/>
-          <w:sz w:val="24"/>
-          <w:szCs w:val="24"/>
-        </w:rPr>
-        <w:br/>
-        <w:t>6. Unauthorized Submit Attempt</w:t>
-      </w:r>
-      <w:r>
-        <w:rPr>
-          <w:rFonts w:ascii="Aptos" w:hAnsi="Aptos"/>
-          <w:sz w:val="24"/>
-          <w:szCs w:val="24"/>
-        </w:rPr>
-        <w:br/>
-      </w:r>
-      <w:r>
-        <w:rPr>
-          <w:rFonts w:ascii="Aptos" w:hAnsi="Aptos"/>
-          <w:sz w:val="24"/>
-          <w:szCs w:val="24"/>
-        </w:rPr>
-        <w:br/>
-        <w:t>POST /api/medical-questionnaire/encounterA/submit</w:t>
-      </w:r>
-      <w:r>
-        <w:rPr>
-          <w:rFonts w:ascii="Aptos" w:hAnsi="Aptos"/>
-          <w:sz w:val="24"/>
-          <w:szCs w:val="24"/>
-        </w:rPr>
-        <w:br/>
-        <w:t>Authorization: Bearer tokenB</w:t>
-      </w:r>
-      <w:r>
-        <w:rPr>
-          <w:rFonts w:ascii="Aptos" w:hAnsi="Aptos"/>
-          <w:sz w:val="24"/>
-          <w:szCs w:val="24"/>
-        </w:rPr>
-        <w:br/>
-      </w:r>
-      <w:r>
-        <w:rPr>
-          <w:rFonts w:ascii="Aptos" w:hAnsi="Aptos"/>
-          <w:sz w:val="24"/>
-          <w:szCs w:val="24"/>
-        </w:rPr>
-        <w:br/>
-        <w:t>{</w:t>
-      </w:r>
-      <w:r>
-        <w:rPr>
-          <w:rFonts w:ascii="Aptos" w:hAnsi="Aptos"/>
-          <w:sz w:val="24"/>
-          <w:szCs w:val="24"/>
-        </w:rPr>
-        <w:br/>
-        <w:t xml:space="preserve">  "confirmation": true</w:t>
-      </w:r>
-      <w:r>
-        <w:rPr>
-          <w:rFonts w:ascii="Aptos" w:hAnsi="Aptos"/>
-          <w:sz w:val="24"/>
-          <w:szCs w:val="24"/>
-        </w:rPr>
-        <w:br/>
-        <w:t>}</w:t>
-      </w:r>
-      <w:r>
-        <w:rPr>
-          <w:rFonts w:ascii="Aptos" w:hAnsi="Aptos"/>
-          <w:sz w:val="24"/>
-          <w:szCs w:val="24"/>
-        </w:rPr>
-        <w:br/>
-      </w:r>
-      <w:r>
-        <w:rPr>
-          <w:rFonts w:ascii="Aptos" w:hAnsi="Aptos"/>
-          <w:sz w:val="24"/>
-          <w:szCs w:val="24"/>
-        </w:rPr>
-        <w:br/>
-        <w:t>Expected: 403 Forbidden or 404 Not Found</w:t>
-      </w:r>
-      <w:r>
-        <w:rPr>
-          <w:rFonts w:ascii="Aptos" w:hAnsi="Aptos"/>
-          <w:sz w:val="24"/>
-          <w:szCs w:val="24"/>
-        </w:rPr>
-        <w:br/>
-      </w:r>
-      <w:r>
-        <w:rPr>
-          <w:rFonts w:ascii="Aptos" w:hAnsi="Aptos"/>
-          <w:sz w:val="24"/>
-          <w:szCs w:val="24"/>
-        </w:rPr>
-        <w:br/>
-        <w:t>------------------------------------------------------</w:t>
-      </w:r>
-      <w:r>
-        <w:rPr>
-          <w:rFonts w:ascii="Aptos" w:hAnsi="Aptos"/>
-          <w:sz w:val="24"/>
-          <w:szCs w:val="24"/>
-        </w:rPr>
-        <w:br/>
-      </w:r>
+        <w:t>step 3 will give you an auth error instead of medical data JSON</w:t>
+      </w:r>
+    </w:p>
+    <w:p>
+      <w:pPr>
+        <w:rPr>
+          <w:rFonts w:ascii="Aptos" w:hAnsi="Aptos"/>
+          <w:sz w:val="24"/>
+          <w:szCs w:val="24"/>
+        </w:rPr>
+      </w:pPr>
+    </w:p>
+    <w:p>
+      <w:pPr>
+        <w:rPr>
+          <w:rFonts w:ascii="Aptos" w:hAnsi="Aptos"/>
+          <w:sz w:val="24"/>
+          <w:szCs w:val="24"/>
+        </w:rPr>
+      </w:pPr>
+      <w:r>
+        <w:rPr>
+          <w:rFonts w:ascii="Aptos" w:hAnsi="Aptos"/>
+          <w:sz w:val="24"/>
+          <w:szCs w:val="24"/>
+        </w:rPr>
+        <w:drawing>
+          <wp:inline distT="0" distB="0" distL="0" distR="0" wp14:anchorId="1A08844E" wp14:editId="36E29018">
+            <wp:extent cx="5486400" cy="2705735"/>
+            <wp:effectExtent l="0" t="0" r="0" b="0"/>
+            <wp:docPr id="1484675035" name="Picture 1"/>
+            <wp:cNvGraphicFramePr>
+              <a:graphicFrameLocks xmlns:a="http://schemas.openxmlformats.org/drawingml/2006/main" noChangeAspect="1"/>
+            </wp:cNvGraphicFramePr>
+            <a:graphic xmlns:a="http://schemas.openxmlformats.org/drawingml/2006/main">
+              <a:graphicData uri="http://schemas.openxmlformats.org/drawingml/2006/picture">
+                <pic:pic xmlns:pic="http://schemas.openxmlformats.org/drawingml/2006/picture">
+                  <pic:nvPicPr>
+                    <pic:cNvPr id="1484675035" name=""/>
+                    <pic:cNvPicPr/>
+                  </pic:nvPicPr>
+                  <pic:blipFill>
+                    <a:blip r:embed="rId11"/>
+                    <a:stretch>
+                      <a:fillRect/>
+                    </a:stretch>
+                  </pic:blipFill>
+                  <pic:spPr>
+                    <a:xfrm>
+                      <a:off x="0" y="0"/>
+                      <a:ext cx="5486400" cy="2705735"/>
+                    </a:xfrm>
+                    <a:prstGeom prst="rect">
+                      <a:avLst/>
+                    </a:prstGeom>
+                  </pic:spPr>
+                </pic:pic>
+              </a:graphicData>
+            </a:graphic>
+          </wp:inline>
+        </w:drawing>
+      </w:r>
+    </w:p>
+    <w:p>
+      <w:pPr>
+        <w:rPr>
+          <w:rFonts w:ascii="Aptos" w:hAnsi="Aptos"/>
+          <w:sz w:val="24"/>
+          <w:szCs w:val="24"/>
+        </w:rPr>
+      </w:pPr>
+      <w:r>
+        <w:rPr>
+          <w:rFonts w:ascii="Aptos" w:hAnsi="Aptos"/>
+          <w:sz w:val="24"/>
+          <w:szCs w:val="24"/>
+        </w:rPr>
+        <w:drawing>
+          <wp:inline distT="0" distB="0" distL="0" distR="0" wp14:anchorId="098AC72B" wp14:editId="29546B77">
+            <wp:extent cx="5486400" cy="2919730"/>
+            <wp:effectExtent l="0" t="0" r="0" b="0"/>
+            <wp:docPr id="860048512" name="Picture 1"/>
+            <wp:cNvGraphicFramePr>
+              <a:graphicFrameLocks xmlns:a="http://schemas.openxmlformats.org/drawingml/2006/main" noChangeAspect="1"/>
+            </wp:cNvGraphicFramePr>
+            <a:graphic xmlns:a="http://schemas.openxmlformats.org/drawingml/2006/main">
+              <a:graphicData uri="http://schemas.openxmlformats.org/drawingml/2006/picture">
+                <pic:pic xmlns:pic="http://schemas.openxmlformats.org/drawingml/2006/picture">
+                  <pic:nvPicPr>
+                    <pic:cNvPr id="860048512" name=""/>
+                    <pic:cNvPicPr/>
+                  </pic:nvPicPr>
+                  <pic:blipFill>
+                    <a:blip r:embed="rId12"/>
+                    <a:stretch>
+                      <a:fillRect/>
+                    </a:stretch>
+                  </pic:blipFill>
+                  <pic:spPr>
+                    <a:xfrm>
+                      <a:off x="0" y="0"/>
+                      <a:ext cx="5486400" cy="2919730"/>
+                    </a:xfrm>
+                    <a:prstGeom prst="rect">
+                      <a:avLst/>
+                    </a:prstGeom>
+                  </pic:spPr>
+                </pic:pic>
+              </a:graphicData>
+            </a:graphic>
+          </wp:inline>
+        </w:drawing>
+      </w:r>
+    </w:p>
+    <w:p>
+      <w:pPr>
+        <w:rPr>
+          <w:rFonts w:ascii="Aptos" w:hAnsi="Aptos"/>
+          <w:sz w:val="24"/>
+          <w:szCs w:val="24"/>
+        </w:rPr>
+      </w:pPr>
+    </w:p>
+    <w:p>
+      <w:pPr>
+        <w:rPr>
+          <w:rFonts w:ascii="Aptos" w:hAnsi="Aptos"/>
+          <w:sz w:val="24"/>
+          <w:szCs w:val="24"/>
+        </w:rPr>
+      </w:pPr>
+    </w:p>
+    <w:p>
+      <w:pPr>
+        <w:rPr>
+          <w:rFonts w:ascii="Aptos" w:hAnsi="Aptos"/>
+          <w:sz w:val="24"/>
+          <w:szCs w:val="24"/>
+        </w:rPr>
+      </w:pPr>
+    </w:p>
+    <w:p>
+      <w:pPr>
+        <w:rPr>
+          <w:rFonts w:ascii="Aptos" w:hAnsi="Aptos"/>
+          <w:sz w:val="24"/>
+          <w:szCs w:val="24"/>
+        </w:rPr>
+      </w:pPr>
+      <w:r>
+        <w:rPr>
+          <w:rFonts w:ascii="Aptos" w:hAnsi="Aptos"/>
+          <w:sz w:val="24"/>
+          <w:szCs w:val="24"/>
+        </w:rPr>
+        <w:t>Question 3</w:t>
+      </w:r>
+    </w:p>
+    <w:p>
+      <w:pPr>
+        <w:rPr>
+          <w:rFonts w:ascii="Aptos" w:hAnsi="Aptos"/>
+          <w:sz w:val="24"/>
+          <w:szCs w:val="24"/>
+        </w:rPr>
+      </w:pPr>
       <w:r>
         <w:rPr>
           <w:rFonts w:ascii="Aptos" w:hAnsi="Aptos"/>
@@ -1351,95 +1252,6 @@
           <w:szCs w:val="24"/>
         </w:rPr>
         <w:lastRenderedPageBreak/>
-        <w:br/>
-        <w:t>Additional Validations:</w:t>
-      </w:r>
-      <w:r>
-        <w:rPr>
-          <w:rFonts w:ascii="Aptos" w:hAnsi="Aptos"/>
-          <w:sz w:val="24"/>
-          <w:szCs w:val="24"/>
-        </w:rPr>
-        <w:br/>
-        <w:t>- Missing token → 401 Unauthorized</w:t>
-      </w:r>
-      <w:r>
-        <w:rPr>
-          <w:rFonts w:ascii="Aptos" w:hAnsi="Aptos"/>
-          <w:sz w:val="24"/>
-          <w:szCs w:val="24"/>
-        </w:rPr>
-        <w:br/>
-        <w:t>- Expired token → 401 Unauthorized</w:t>
-      </w:r>
-      <w:r>
-        <w:rPr>
-          <w:rFonts w:ascii="Aptos" w:hAnsi="Aptos"/>
-          <w:sz w:val="24"/>
-          <w:szCs w:val="24"/>
-        </w:rPr>
-        <w:br/>
-        <w:t>- Tampered token → 401 Unauthorized</w:t>
-      </w:r>
-    </w:p>
-    <w:p>
-      <w:pPr>
-        <w:rPr>
-          <w:rFonts w:ascii="Aptos" w:hAnsi="Aptos"/>
-          <w:sz w:val="24"/>
-          <w:szCs w:val="24"/>
-        </w:rPr>
-      </w:pPr>
-    </w:p>
-    <w:p>
-      <w:pPr>
-        <w:rPr>
-          <w:rFonts w:ascii="Aptos" w:hAnsi="Aptos"/>
-          <w:sz w:val="24"/>
-          <w:szCs w:val="24"/>
-        </w:rPr>
-      </w:pPr>
-    </w:p>
-    <w:p>
-      <w:pPr>
-        <w:rPr>
-          <w:rFonts w:ascii="Aptos" w:hAnsi="Aptos"/>
-          <w:sz w:val="24"/>
-          <w:szCs w:val="24"/>
-        </w:rPr>
-      </w:pPr>
-    </w:p>
-    <w:p>
-      <w:pPr>
-        <w:rPr>
-          <w:rFonts w:ascii="Aptos" w:hAnsi="Aptos"/>
-          <w:sz w:val="24"/>
-          <w:szCs w:val="24"/>
-        </w:rPr>
-      </w:pPr>
-      <w:r>
-        <w:rPr>
-          <w:rFonts w:ascii="Aptos" w:hAnsi="Aptos"/>
-          <w:sz w:val="24"/>
-          <w:szCs w:val="24"/>
-        </w:rPr>
-        <w:t>Question 3</w:t>
-      </w:r>
-    </w:p>
-    <w:p>
-      <w:pPr>
-        <w:rPr>
-          <w:rFonts w:ascii="Aptos" w:hAnsi="Aptos"/>
-          <w:sz w:val="24"/>
-          <w:szCs w:val="24"/>
-        </w:rPr>
-      </w:pPr>
-      <w:r>
-        <w:rPr>
-          <w:rFonts w:ascii="Aptos" w:hAnsi="Aptos"/>
-          <w:sz w:val="24"/>
-          <w:szCs w:val="24"/>
-        </w:rPr>
         <w:t>Following authentication</w:t>
       </w:r>
       <w:r>
@@ -1642,6 +1454,14 @@
           <w:szCs w:val="24"/>
         </w:rPr>
         <w:t>security test</w:t>
+      </w:r>
+      <w:r>
+        <w:rPr>
+          <w:rFonts w:ascii="Aptos" w:hAnsi="Aptos"/>
+          <w:sz w:val="24"/>
+          <w:szCs w:val="24"/>
+        </w:rPr>
+        <w:t>s</w:t>
       </w:r>
     </w:p>
     <w:p>

</xml_diff>